<commit_message>
Redactar brecha de investigación en el entregable del TG
Reemplaza el placeholder por el contraste dominio–método–evaluación
y cierra con cómo el trabajo cubre esa brecha, alineado al objetivo
de caracterizar la construcción de conocimiento sobre Hugging Face.

Co-authored-by: Juan Esteban Gamba Aguilera <juan-aguilera@users.noreply.github.com>
</commit_message>
<xml_diff>
--- a/Documentacion Avance TG/entregable TG.docx
+++ b/Documentacion Avance TG/entregable TG.docx
@@ -1680,7 +1680,7 @@
           <w:sz w:val="20"/>
           <w:lang w:val="es-ES"/>
         </w:rPr>
-        <w:t xml:space="preserve">[Por escribir] </w:t>
+        <w:t>La literatura reciente ha consolidado a GraphRAG como alternativa al RAG vectorial cuando la consulta exige razonamiento multi-salto o interpretación global (sensemaking) (Edge et al., 2024; Ghosh y Mittal, 2025; Klein et al., 2006). Las aplicaciones publicadas se concentran en dominios industriales, gubernamentales y clínicos: diagnóstico de fallas en aeronaves, desechos orbitales, minería, gobierno electrónico, manufactura y salud (Xie et al., 2025; Roll et al., 2025; Li et al., 2025; Papageorgiou et al., 2025; Knollmeyer et al., 2025; Evangelista et al., 2026). En la literatura revisada no se identifica un sistema equivalente sobre el ecosistema Hugging Face, es decir, sobre la red de modelos, conjuntos de datos, spaces, autores, etiquetas, discusiones y commits que hoy concentra la IA abierta.</w:t>
       </w:r>
       <w:proofErr w:type="spellStart"/>
       <w:r>
@@ -1690,7 +1690,6 @@
           <w:sz w:val="20"/>
           <w:lang w:val="es-ES"/>
         </w:rPr>
-        <w:t>GraphRAG</w:t>
       </w:r>
       <w:proofErr w:type="spellEnd"/>
       <w:r>
@@ -1700,7 +1699,66 @@
           <w:sz w:val="20"/>
           <w:lang w:val="es-ES"/>
         </w:rPr>
-        <w:t xml:space="preserve"> aplicado a los metadatos de un ecosistema de IA abierta, con un grafo construido a partir de datos estructurados (no extraído de texto por un LLM).</w:t>
+      </w:r>
+    </w:p>
+    <w:p>
+      <w:pPr>
+        <w:shd w:val="clear" w:color="auto" w:fill="E8EEF5"/>
+        <w:spacing w:before="60" w:after="120" w:line="360" w:lineRule="auto"/>
+        <w:jc w:val="both"/>
+        <w:rPr>
+          <w:lang w:val="es-ES"/>
+        </w:rPr>
+      </w:pPr>
+      <w:proofErr w:type="spellStart"/>
+      <w:proofErr w:type="spellEnd"/>
+      <w:r>
+        <w:t>Ese vacío no se resuelve con las herramientas de exploración existentes. El Hub se consulta por búsqueda o filtros, y HFCommunity (Ait et al., 2024) organiza los metadatos en un esquema relacional consultable con SQL. Ambas vías exigen alfabetización técnica y no atraviesan, en lenguaje natural, trayectorias del tipo autor → modelo → dataset → tarea → licencia. Ait et al. (2024) señalan, además, la posibilidad de aplicar técnicas de PLN sobre las descripciones de los repositorios para obtener anotaciones de grano fino y análisis de explicabilidad; esa línea queda abierta y se alinea con GraphRAG, pero no se materializa en un sistema de consulta semántica sobre el grafo del Hub.</w:t>
+      </w:r>
+    </w:p>
+    <w:p>
+      <w:pPr>
+        <w:shd w:val="clear" w:color="auto" w:fill="E8EEF5"/>
+        <w:spacing w:before="60" w:after="120" w:line="360" w:lineRule="auto"/>
+        <w:jc w:val="both"/>
+        <w:rPr>
+          <w:lang w:val="es-ES"/>
+        </w:rPr>
+      </w:pPr>
+      <w:proofErr w:type="spellStart"/>
+      <w:proofErr w:type="spellEnd"/>
+      <w:r>
+        <w:t>Hay un segundo hueco, de método. El GraphRAG canónico construye el grafo de conocimiento extrayendo entidades y relaciones de un corpus textual con un modelo de lenguaje (Edge et al., 2024; Larson y Truitt, 2024). Ese diseño es adecuado cuando la fuente es documental, pero introduce ruido de extracción y debilita la auditabilidad cuando el dominio ya es relacional. No se ha caracterizado un GraphRAG cuyo grafo se derive de metadatos estructurados de un ecosistema de IA abierta —sin inferir el esquema con un LLM—, complementado con una capa vectorial sobre nodos y con traducción de lenguaje natural a Cypher (Tran et al., 2024). La alfabetización digital motiva el problema; la brecha científica está en el dominio, en la construcción del grafo y en la forma de recuperarlo.</w:t>
+      </w:r>
+    </w:p>
+    <w:p>
+      <w:pPr>
+        <w:shd w:val="clear" w:color="auto" w:fill="E8EEF5"/>
+        <w:spacing w:before="60" w:after="120" w:line="360" w:lineRule="auto"/>
+        <w:jc w:val="both"/>
+        <w:rPr>
+          <w:lang w:val="es-ES"/>
+        </w:rPr>
+      </w:pPr>
+      <w:proofErr w:type="spellStart"/>
+      <w:proofErr w:type="spellEnd"/>
+      <w:r>
+        <w:t>El tercer hueco es de evaluación. Las preguntas de sensemaking sobre Hugging Face no tienen una única respuesta correcta, y los bancos multi-salto de referencia (HotpotQA, 2WikiMultihopQA, MuSiQue; Arseven et al., 2026) no cubren este dominio. Falta un protocolo que combine un banco de preguntas multi-salto sobre metadatos de IA abierta con la adaptación de LLM-as-a-Judge (Zheng et al., 2023) a la construcción de conocimiento, y no solo a la coincidencia con un ground truth.</w:t>
+      </w:r>
+    </w:p>
+    <w:p>
+      <w:pPr>
+        <w:shd w:val="clear" w:color="auto" w:fill="E8EEF5"/>
+        <w:spacing w:before="60" w:after="120" w:line="360" w:lineRule="auto"/>
+        <w:jc w:val="both"/>
+        <w:rPr>
+          <w:lang w:val="es-ES"/>
+        </w:rPr>
+      </w:pPr>
+      <w:proofErr w:type="spellStart"/>
+      <w:proofErr w:type="spellEnd"/>
+      <w:r>
+        <w:t>Esta investigación cubre esa brecha al (i) construir un grafo de conocimiento en Neo4j a partir de HFCommunity, conservando relaciones explícitas del dump estructurado; (ii) combinar búsqueda vectorial multi-etiqueta, generación de Cypher y memoria conversacional para consultas en lenguaje natural; y (iii) evaluar el sistema con preguntas multi-salto y un juez LLM sobre preguntas de sensemaking. El objetivo no es únicamente recuperar recursos, sino caracterizar el proceso de construcción de conocimiento sobre inteligencia artificial abierta cuando la recuperación se ancla en la topología del grafo. Esa caracterización alinea el objetivo general —caracterizar el proceso de construcción de conocimiento sobre inteligencia artificial abierta— con la metodología que se describe a continuación.</w:t>
       </w:r>
     </w:p>
     <w:p>

</xml_diff>